<commit_message>
docs(appointment): add wireframes for calendar view and appointment detail screens
</commit_message>
<xml_diff>
--- a/docs/Wireframes_PatientProfileAndMedicalHistory.docx
+++ b/docs/Wireframes_PatientProfileAndMedicalHistory.docx
@@ -99,7 +99,7 @@
           <w:sz w:val="22"/>
           <w:shd w:fill="auto" w:val="clear"/>
         </w:rPr>
-        <w:t xml:space="preserve"> Aisha Umar</w:t>
+        <w:t xml:space="preserve"> Ayesha Umar</w:t>
       </w:r>
     </w:p>
     <w:p>
@@ -588,7 +588,6 @@
               <w:rPr>
                 <w:spacing w:val="0"/>
                 <w:position w:val="0"/>
-                <w:shd w:fill="auto" w:val="clear"/>
               </w:rPr>
             </w:pPr>
             <w:r>
@@ -897,7 +896,6 @@
                       <w:color w:val="auto"/>
                       <w:spacing w:val="0"/>
                       <w:position w:val="0"/>
-                      <w:shd w:fill="auto" w:val="clear"/>
                     </w:rPr>
                   </w:pPr>
                   <w:r>
@@ -939,7 +937,6 @@
                       <w:color w:val="auto"/>
                       <w:spacing w:val="0"/>
                       <w:position w:val="0"/>
-                      <w:shd w:fill="auto" w:val="clear"/>
                     </w:rPr>
                   </w:pPr>
                   <w:r>
@@ -981,7 +978,6 @@
                       <w:color w:val="auto"/>
                       <w:spacing w:val="0"/>
                       <w:position w:val="0"/>
-                      <w:shd w:fill="auto" w:val="clear"/>
                     </w:rPr>
                   </w:pPr>
                   <w:r>
@@ -1023,7 +1019,6 @@
                       <w:color w:val="auto"/>
                       <w:spacing w:val="0"/>
                       <w:position w:val="0"/>
-                      <w:shd w:fill="auto" w:val="clear"/>
                     </w:rPr>
                   </w:pPr>
                   <w:r>
@@ -1071,7 +1066,6 @@
                       <w:color w:val="auto"/>
                       <w:spacing w:val="0"/>
                       <w:position w:val="0"/>
-                      <w:shd w:fill="auto" w:val="clear"/>
                     </w:rPr>
                   </w:pPr>
                   <w:r>
@@ -1112,7 +1106,6 @@
                       <w:color w:val="auto"/>
                       <w:spacing w:val="0"/>
                       <w:position w:val="0"/>
-                      <w:shd w:fill="auto" w:val="clear"/>
                     </w:rPr>
                   </w:pPr>
                   <w:r>
@@ -1152,7 +1145,6 @@
                     <w:rPr>
                       <w:spacing w:val="0"/>
                       <w:position w:val="0"/>
-                      <w:shd w:fill="auto" w:val="clear"/>
                     </w:rPr>
                   </w:pPr>
                   <w:r>
@@ -1193,7 +1185,6 @@
                       <w:color w:val="auto"/>
                       <w:spacing w:val="0"/>
                       <w:position w:val="0"/>
-                      <w:shd w:fill="auto" w:val="clear"/>
                     </w:rPr>
                   </w:pPr>
                   <w:r>
@@ -1240,7 +1231,6 @@
                       <w:color w:val="auto"/>
                       <w:spacing w:val="0"/>
                       <w:position w:val="0"/>
-                      <w:shd w:fill="auto" w:val="clear"/>
                     </w:rPr>
                   </w:pPr>
                   <w:r>
@@ -1281,7 +1271,6 @@
                       <w:color w:val="auto"/>
                       <w:spacing w:val="0"/>
                       <w:position w:val="0"/>
-                      <w:shd w:fill="auto" w:val="clear"/>
                     </w:rPr>
                   </w:pPr>
                   <w:r>
@@ -1321,7 +1310,6 @@
                     <w:rPr>
                       <w:spacing w:val="0"/>
                       <w:position w:val="0"/>
-                      <w:shd w:fill="auto" w:val="clear"/>
                     </w:rPr>
                   </w:pPr>
                   <w:r>
@@ -1362,7 +1350,6 @@
                       <w:color w:val="auto"/>
                       <w:spacing w:val="0"/>
                       <w:position w:val="0"/>
-                      <w:shd w:fill="auto" w:val="clear"/>
                     </w:rPr>
                   </w:pPr>
                   <w:r>
@@ -1409,7 +1396,6 @@
                       <w:color w:val="auto"/>
                       <w:spacing w:val="0"/>
                       <w:position w:val="0"/>
-                      <w:shd w:fill="auto" w:val="clear"/>
                     </w:rPr>
                   </w:pPr>
                   <w:r>
@@ -1450,7 +1436,6 @@
                       <w:color w:val="auto"/>
                       <w:spacing w:val="0"/>
                       <w:position w:val="0"/>
-                      <w:shd w:fill="auto" w:val="clear"/>
                     </w:rPr>
                   </w:pPr>
                   <w:r>
@@ -1490,7 +1475,6 @@
                     <w:rPr>
                       <w:spacing w:val="0"/>
                       <w:position w:val="0"/>
-                      <w:shd w:fill="auto" w:val="clear"/>
                     </w:rPr>
                   </w:pPr>
                   <w:r>
@@ -1531,7 +1515,6 @@
                       <w:color w:val="auto"/>
                       <w:spacing w:val="0"/>
                       <w:position w:val="0"/>
-                      <w:shd w:fill="auto" w:val="clear"/>
                     </w:rPr>
                   </w:pPr>
                   <w:r>
@@ -1557,7 +1540,6 @@
               <w:rPr>
                 <w:spacing w:val="0"/>
                 <w:position w:val="0"/>
-                <w:shd w:fill="auto" w:val="clear"/>
               </w:rPr>
             </w:pPr>
           </w:p>

</xml_diff>